<commit_message>
Adopt official Medra logo set across design system, brand assets, PRD & README
Replaced placeholder marks with the six official SVG variants (Gradient, Navy Blue,
Teal, White, Inverse, Stroke). Rasterised into the Figma bundle and wired through the
logo frames (cover, primary, construction, variations + lockups, contact, sidebar);
regenerated glow, app-icon, favicon and lockups from the real mark. Refreshed brand/
master set, added the logo to the PRD docx cover and the repo README. Re-validated
ALL 21 CLEAN.

Co-Authored-By: Claude Opus 4.8 <noreply@anthropic.com>
Claude-Session: https://claude.ai/code/session_01UPUxa2D6kZSi6yifNoCBzz
</commit_message>
<xml_diff>
--- a/docs/Medra_PRD.docx
+++ b/docs/Medra_PRD.docx
@@ -4,16 +4,62 @@
   <w:body>
     <w:p>
       <w:pPr>
-        <w:spacing w:after="0" w:before="2600"/>
+        <w:spacing w:after="0" w:before="2200"/>
         <w:jc w:val="center"/>
       </w:pPr>
       <w:r>
+        <w:drawing>
+          <wp:inline distT="0" distB="0" distL="0" distR="0">
+            <wp:extent cx="2857500" cy="2124075"/>
+            <wp:effectExtent t="0" r="0" b="0" l="0"/>
+            <wp:docPr id="1" name="" descr="" title=""/>
+            <wp:cNvGraphicFramePr>
+              <a:graphicFrameLocks xmlns:a="http://schemas.openxmlformats.org/drawingml/2006/main" noChangeAspect="1"/>
+            </wp:cNvGraphicFramePr>
+            <a:graphic xmlns:a="http://schemas.openxmlformats.org/drawingml/2006/main">
+              <a:graphicData uri="http://schemas.openxmlformats.org/drawingml/2006/picture">
+                <pic:pic xmlns:pic="http://schemas.openxmlformats.org/drawingml/2006/picture">
+                  <pic:nvPicPr>
+                    <pic:cNvPr id="0" name="" descr=""/>
+                    <pic:cNvPicPr>
+                      <a:picLocks noChangeAspect="1" noChangeArrowheads="1"/>
+                    </pic:cNvPicPr>
+                  </pic:nvPicPr>
+                  <pic:blipFill>
+                    <a:blip r:embed="rId8" cstate="none"/>
+                    <a:srcRect/>
+                    <a:stretch>
+                      <a:fillRect/>
+                    </a:stretch>
+                  </pic:blipFill>
+                  <pic:spPr bwMode="auto">
+                    <a:xfrm>
+                      <a:off x="0" y="0"/>
+                      <a:ext cx="2857500" cy="2124075"/>
+                    </a:xfrm>
+                    <a:prstGeom prst="rect">
+                      <a:avLst/>
+                    </a:prstGeom>
+                  </pic:spPr>
+                </pic:pic>
+              </a:graphicData>
+            </a:graphic>
+          </wp:inline>
+        </w:drawing>
+      </w:r>
+    </w:p>
+    <w:p>
+      <w:pPr>
+        <w:spacing w:after="0" w:before="220"/>
+        <w:jc w:val="center"/>
+      </w:pPr>
+      <w:r>
         <w:rPr>
           <w:b/>
           <w:bCs/>
           <w:color w:val="1B3A5B"/>
-          <w:sz w:val="96"/>
-          <w:szCs w:val="96"/>
+          <w:sz w:val="72"/>
+          <w:szCs w:val="72"/>
         </w:rPr>
         <w:t xml:space="preserve">MEDRA</w:t>
       </w:r>
@@ -10322,7 +10368,7 @@
         <w:spacing w:after="80" w:before="260"/>
       </w:pPr>
       <w:r>
-        <w:t xml:space="preserve">22. Open Questions — To Confirm Before Kickoff</w:t>
+        <w:t xml:space="preserve">22. What You Might Be Missing — Gaps &amp; Recommendations</w:t>
       </w:r>
     </w:p>
     <w:p>
@@ -10330,332 +10376,560 @@
         <w:spacing w:after="100"/>
       </w:pPr>
       <w:r>
-        <w:t xml:space="preserve">From the design scope, plus additions:</w:t>
-      </w:r>
-    </w:p>
-    <w:p>
-      <w:pPr>
-        <w:pStyle w:val="ListParagraph"/>
-        <w:numPr>
-          <w:ilvl w:val="0"/>
-          <w:numId w:val="2"/>
-        </w:numPr>
-        <w:spacing w:after="40"/>
-      </w:pPr>
-      <w:r>
-        <w:rPr>
-          <w:b/>
-          <w:bCs/>
-        </w:rPr>
-        <w:t xml:space="preserve">Platform target:</w:t>
-      </w:r>
-      <w:r>
-        <w:t xml:space="preserve"> mobile app, responsive web, or both for MVP? </w:t>
+        <w:t xml:space="preserve">A candid list of things not fully addressed in the brief/scope/MVP that typically bite medical platforms. Prioritised.</w:t>
+      </w:r>
+    </w:p>
+    <w:p>
+      <w:pPr>
+        <w:spacing w:after="100"/>
+      </w:pPr>
+      <w:r>
+        <w:rPr>
+          <w:b/>
+          <w:bCs/>
+        </w:rPr>
+        <w:t xml:space="preserve">A. Compliance &amp; legal (highest priority)</w:t>
+      </w:r>
+    </w:p>
+    <w:p>
+      <w:pPr>
+        <w:pStyle w:val="ListParagraph"/>
+        <w:numPr>
+          <w:ilvl w:val="0"/>
+          <w:numId w:val="1"/>
+        </w:numPr>
+        <w:spacing w:after="40"/>
+      </w:pPr>
+      <w:r>
+        <w:rPr>
+          <w:b/>
+          <w:bCs/>
+        </w:rPr>
+        <w:t xml:space="preserve">NDPA 2023 / NDPR compliance</w:t>
+      </w:r>
+      <w:r>
+        <w:t xml:space="preserve"> and a written data-protection/privacy policy, patient consent flows, and data-subject rights (access, deletion). Medical data is high-risk; build this into MVP, not later.</w:t>
+      </w:r>
+    </w:p>
+    <w:p>
+      <w:pPr>
+        <w:pStyle w:val="ListParagraph"/>
+        <w:numPr>
+          <w:ilvl w:val="0"/>
+          <w:numId w:val="1"/>
+        </w:numPr>
+        <w:spacing w:after="40"/>
+      </w:pPr>
+      <w:r>
+        <w:rPr>
+          <w:b/>
+          <w:bCs/>
+        </w:rPr>
+        <w:t xml:space="preserve">Terms of Service, provider agreements, and liability/disclaimer</w:t>
+      </w:r>
+      <w:r>
+        <w:t xml:space="preserve"> language — especially around telemedicine and clinical decisions made using Medra records. Consider professional-indemnity implications.</w:t>
+      </w:r>
+    </w:p>
+    <w:p>
+      <w:pPr>
+        <w:pStyle w:val="ListParagraph"/>
+        <w:numPr>
+          <w:ilvl w:val="0"/>
+          <w:numId w:val="1"/>
+        </w:numPr>
+        <w:spacing w:after="40"/>
+      </w:pPr>
+      <w:r>
+        <w:rPr>
+          <w:b/>
+          <w:bCs/>
+        </w:rPr>
+        <w:t xml:space="preserve">Data residency &amp; retention policy</w:t>
+      </w:r>
+      <w:r>
+        <w:t xml:space="preserve"> — where records are stored and for how long.</w:t>
+      </w:r>
+    </w:p>
+    <w:p>
+      <w:pPr>
+        <w:spacing w:after="100"/>
+      </w:pPr>
+      <w:r>
+        <w:rPr>
+          <w:b/>
+          <w:bCs/>
+        </w:rPr>
+        <w:t xml:space="preserve">B. Clinical safety</w:t>
+      </w:r>
+    </w:p>
+    <w:p>
+      <w:pPr>
+        <w:pStyle w:val="ListParagraph"/>
+        <w:numPr>
+          <w:ilvl w:val="0"/>
+          <w:numId w:val="1"/>
+        </w:numPr>
+        <w:spacing w:after="40"/>
+      </w:pPr>
+      <w:r>
+        <w:t xml:space="preserve">The </w:t>
+      </w:r>
+      <w:r>
+        <w:rPr>
+          <w:b/>
+          <w:bCs/>
+        </w:rPr>
+        <w:t xml:space="preserve">drug-interaction goal from the brief is currently manual</w:t>
+      </w:r>
+      <w:r>
+        <w:t xml:space="preserve"> (doctor reads history). Flag explicitly that automated interaction checking is a later phase, and ensure the record UI makes current medications prominent so a doctor </w:t>
       </w:r>
       <w:r>
         <w:rPr>
           <w:i/>
           <w:iCs/>
         </w:rPr>
-        <w:t xml:space="preserve">(MVP doc says responsive web — confirm.)</w:t>
-      </w:r>
-    </w:p>
-    <w:p>
-      <w:pPr>
-        <w:pStyle w:val="ListParagraph"/>
-        <w:numPr>
-          <w:ilvl w:val="0"/>
-          <w:numId w:val="2"/>
-        </w:numPr>
-        <w:spacing w:after="40"/>
-      </w:pPr>
-      <w:r>
-        <w:rPr>
-          <w:b/>
-          <w:bCs/>
-        </w:rPr>
-        <w:t xml:space="preserve">Brand identity:</w:t>
-      </w:r>
-      <w:r>
-        <w:t xml:space="preserve"> logo/colors exist (Medra blue-gradient mark) — is any further brand work in scope?</w:t>
-      </w:r>
-    </w:p>
-    <w:p>
-      <w:pPr>
-        <w:pStyle w:val="ListParagraph"/>
-        <w:numPr>
-          <w:ilvl w:val="0"/>
-          <w:numId w:val="2"/>
-        </w:numPr>
-        <w:spacing w:after="40"/>
-      </w:pPr>
-      <w:r>
-        <w:rPr>
-          <w:b/>
-          <w:bCs/>
-        </w:rPr>
-        <w:t xml:space="preserve">Staff roles beyond doctors</w:t>
-      </w:r>
-      <w:r>
-        <w:t xml:space="preserve"> (nurses, receptionists, lab techs) needing distinct permissions? </w:t>
-      </w:r>
-      <w:r>
-        <w:rPr>
-          <w:i/>
-          <w:iCs/>
-        </w:rPr>
-        <w:t xml:space="preserve">(Drives RBAC.)</w:t>
-      </w:r>
-    </w:p>
-    <w:p>
-      <w:pPr>
-        <w:pStyle w:val="ListParagraph"/>
-        <w:numPr>
-          <w:ilvl w:val="0"/>
-          <w:numId w:val="2"/>
-        </w:numPr>
-        <w:spacing w:after="40"/>
-      </w:pPr>
-      <w:r>
-        <w:rPr>
-          <w:b/>
-          <w:bCs/>
-        </w:rPr>
-        <w:t xml:space="preserve">Booking depth:</w:t>
-      </w:r>
-      <w:r>
-        <w:t xml:space="preserve"> real-time calendar sync, waitlists, cancellations, </w:t>
-      </w:r>
-      <w:r>
-        <w:rPr>
-          <w:b/>
-          <w:bCs/>
-        </w:rPr>
-        <w:t xml:space="preserve">rescheduling</w:t>
-      </w:r>
-      <w:r>
-        <w:t xml:space="preserve"> — which are MVP? </w:t>
-      </w:r>
-      <w:r>
-        <w:rPr>
-          <w:i/>
-          <w:iCs/>
-        </w:rPr>
-        <w:t xml:space="preserve">(Cancellation is in; rescheduling appears Phase 2.)</w:t>
-      </w:r>
-    </w:p>
-    <w:p>
-      <w:pPr>
-        <w:pStyle w:val="ListParagraph"/>
-        <w:numPr>
-          <w:ilvl w:val="0"/>
-          <w:numId w:val="2"/>
-        </w:numPr>
-        <w:spacing w:after="40"/>
-      </w:pPr>
-      <w:r>
-        <w:rPr>
-          <w:b/>
-          <w:bCs/>
-        </w:rPr>
-        <w:t xml:space="preserve">Inter-staff communication:</w:t>
-      </w:r>
-      <w:r>
-        <w:t xml:space="preserve"> direct messaging, task assignment, notes on records, or all three?</w:t>
-      </w:r>
-    </w:p>
-    <w:p>
-      <w:pPr>
-        <w:pStyle w:val="ListParagraph"/>
-        <w:numPr>
-          <w:ilvl w:val="0"/>
-          <w:numId w:val="2"/>
-        </w:numPr>
-        <w:spacing w:after="40"/>
-      </w:pPr>
-      <w:r>
-        <w:rPr>
-          <w:b/>
-          <w:bCs/>
-        </w:rPr>
-        <w:t xml:space="preserve">Patient→institution payments:</w:t>
-      </w:r>
-      <w:r>
-        <w:t xml:space="preserve"> ever processed in-platform, or always offline? </w:t>
-      </w:r>
-      <w:r>
-        <w:rPr>
-          <w:i/>
-          <w:iCs/>
-        </w:rPr>
-        <w:t xml:space="preserve">(Currently offline.)</w:t>
-      </w:r>
-    </w:p>
-    <w:p>
-      <w:pPr>
-        <w:pStyle w:val="ListParagraph"/>
-        <w:numPr>
-          <w:ilvl w:val="0"/>
-          <w:numId w:val="2"/>
-        </w:numPr>
-        <w:spacing w:after="40"/>
-      </w:pPr>
-      <w:r>
-        <w:rPr>
-          <w:b/>
-          <w:bCs/>
-        </w:rPr>
-        <w:t xml:space="preserve">Development team in place?</w:t>
-      </w:r>
-      <w:r>
-        <w:t xml:space="preserve"> Affects handoff-doc depth.</w:t>
-      </w:r>
-    </w:p>
-    <w:p>
-      <w:pPr>
-        <w:pStyle w:val="ListParagraph"/>
-        <w:numPr>
-          <w:ilvl w:val="0"/>
-          <w:numId w:val="2"/>
-        </w:numPr>
-        <w:spacing w:after="40"/>
-      </w:pPr>
-      <w:r>
-        <w:rPr>
-          <w:b/>
-          <w:bCs/>
-        </w:rPr>
-        <w:t xml:space="preserve">Reference apps</w:t>
-      </w:r>
-      <w:r>
-        <w:t xml:space="preserve"> to emulate or avoid (look/feel/UX)?</w:t>
-      </w:r>
-    </w:p>
-    <w:p>
-      <w:pPr>
-        <w:pStyle w:val="ListParagraph"/>
-        <w:numPr>
-          <w:ilvl w:val="0"/>
-          <w:numId w:val="2"/>
-        </w:numPr>
-        <w:spacing w:after="40"/>
-      </w:pPr>
-      <w:r>
-        <w:rPr>
-          <w:b/>
-          <w:bCs/>
-        </w:rPr>
-        <w:t xml:space="preserve">NDPR/medical-data handling:</w:t>
-      </w:r>
-      <w:r>
-        <w:t xml:space="preserve"> specific consent, access-logging, or visibility requirements the UI must reflect?</w:t>
-      </w:r>
-    </w:p>
-    <w:p>
-      <w:pPr>
-        <w:pStyle w:val="ListParagraph"/>
-        <w:numPr>
-          <w:ilvl w:val="0"/>
-          <w:numId w:val="2"/>
-        </w:numPr>
-        <w:spacing w:after="40"/>
-      </w:pPr>
-      <w:r>
-        <w:rPr>
-          <w:b/>
-          <w:bCs/>
-        </w:rPr>
-        <w:t xml:space="preserve">MVP vs v2 feature line</w:t>
-      </w:r>
-      <w:r>
-        <w:t xml:space="preserve"> — confirm the cut in §7/§9 is final.</w:t>
-      </w:r>
-    </w:p>
-    <w:p>
-      <w:pPr>
-        <w:pStyle w:val="ListParagraph"/>
-        <w:numPr>
-          <w:ilvl w:val="0"/>
-          <w:numId w:val="2"/>
-        </w:numPr>
-        <w:spacing w:after="40"/>
-      </w:pPr>
-      <w:r>
-        <w:rPr>
-          <w:b/>
-          <w:bCs/>
-        </w:rPr>
-        <w:t xml:space="preserve">SMS provider</w:t>
-      </w:r>
-      <w:r>
-        <w:t xml:space="preserve"> and cost model (Termii vs Twilio vs other)?</w:t>
-      </w:r>
-    </w:p>
-    <w:p>
-      <w:pPr>
-        <w:pStyle w:val="ListParagraph"/>
-        <w:numPr>
-          <w:ilvl w:val="0"/>
-          <w:numId w:val="2"/>
-        </w:numPr>
-        <w:spacing w:after="40"/>
-      </w:pPr>
-      <w:r>
-        <w:rPr>
-          <w:b/>
-          <w:bCs/>
-        </w:rPr>
-        <w:t xml:space="preserve">Subscription price point</w:t>
-      </w:r>
-      <w:r>
-        <w:t xml:space="preserve"> (₦___/month) and plan tiers by size?</w:t>
-      </w:r>
-    </w:p>
-    <w:p>
-      <w:pPr>
-        <w:pStyle w:val="ListParagraph"/>
-        <w:numPr>
-          <w:ilvl w:val="0"/>
-          <w:numId w:val="2"/>
-        </w:numPr>
-        <w:spacing w:after="40"/>
-      </w:pPr>
-      <w:r>
-        <w:rPr>
-          <w:b/>
-          <w:bCs/>
-        </w:rPr>
-        <w:t xml:space="preserve">Employer/organisation-sponsored plans</w:t>
-      </w:r>
-      <w:r>
-        <w:t xml:space="preserve"> — in or out for pilot? </w:t>
-      </w:r>
-      <w:r>
-        <w:rPr>
-          <w:i/>
-          <w:iCs/>
-        </w:rPr>
-        <w:t xml:space="preserve">(Raised on call as feasible; suggest Phase 2+.)</w:t>
-      </w:r>
-    </w:p>
-    <w:p>
-      <w:pPr>
-        <w:pStyle w:val="ListParagraph"/>
-        <w:numPr>
-          <w:ilvl w:val="0"/>
-          <w:numId w:val="2"/>
-        </w:numPr>
-        <w:spacing w:after="40"/>
-      </w:pPr>
-      <w:r>
-        <w:rPr>
-          <w:b/>
-          <w:bCs/>
-        </w:rPr>
-        <w:t xml:space="preserve">Consultation-fee handling for virtual bookings</w:t>
-      </w:r>
-      <w:r>
-        <w:t xml:space="preserve"> — some clinics require pre-booking payment for online consults; how is that reconciled with "patients pay institutions directly"?</w:t>
+        <w:t xml:space="preserve">can</w:t>
+      </w:r>
+      <w:r>
+        <w:t xml:space="preserve"> catch clashes.</w:t>
+      </w:r>
+    </w:p>
+    <w:p>
+      <w:pPr>
+        <w:pStyle w:val="ListParagraph"/>
+        <w:numPr>
+          <w:ilvl w:val="0"/>
+          <w:numId w:val="1"/>
+        </w:numPr>
+        <w:spacing w:after="40"/>
+      </w:pPr>
+      <w:r>
+        <w:rPr>
+          <w:b/>
+          <w:bCs/>
+        </w:rPr>
+        <w:t xml:space="preserve">Allergies and chronic conditions</w:t>
+      </w:r>
+      <w:r>
+        <w:t xml:space="preserve"> aren't in the basic record fields — consider adding an "allergies / known conditions / current medications" summary block, as it's the highest-value safety data at a glance.</w:t>
+      </w:r>
+    </w:p>
+    <w:p>
+      <w:pPr>
+        <w:pStyle w:val="ListParagraph"/>
+        <w:numPr>
+          <w:ilvl w:val="0"/>
+          <w:numId w:val="1"/>
+        </w:numPr>
+        <w:spacing w:after="40"/>
+      </w:pPr>
+      <w:r>
+        <w:rPr>
+          <w:b/>
+          <w:bCs/>
+        </w:rPr>
+        <w:t xml:space="preserve">Emergency/critical info</w:t>
+      </w:r>
+      <w:r>
+        <w:t xml:space="preserve"> — blood group, emergency contact.</w:t>
+      </w:r>
+    </w:p>
+    <w:p>
+      <w:pPr>
+        <w:spacing w:after="100"/>
+      </w:pPr>
+      <w:r>
+        <w:rPr>
+          <w:b/>
+          <w:bCs/>
+        </w:rPr>
+        <w:t xml:space="preserve">C. Product/UX gaps</w:t>
+      </w:r>
+    </w:p>
+    <w:p>
+      <w:pPr>
+        <w:pStyle w:val="ListParagraph"/>
+        <w:numPr>
+          <w:ilvl w:val="0"/>
+          <w:numId w:val="1"/>
+        </w:numPr>
+        <w:spacing w:after="40"/>
+      </w:pPr>
+      <w:r>
+        <w:rPr>
+          <w:b/>
+          <w:bCs/>
+        </w:rPr>
+        <w:t xml:space="preserve">Rescheduling</w:t>
+      </w:r>
+      <w:r>
+        <w:t xml:space="preserve"> (not just cancel) — patients will want it; currently Phase 2. Confirm that's acceptable for pilot.</w:t>
+      </w:r>
+    </w:p>
+    <w:p>
+      <w:pPr>
+        <w:pStyle w:val="ListParagraph"/>
+        <w:numPr>
+          <w:ilvl w:val="0"/>
+          <w:numId w:val="1"/>
+        </w:numPr>
+        <w:spacing w:after="40"/>
+      </w:pPr>
+      <w:r>
+        <w:rPr>
+          <w:b/>
+          <w:bCs/>
+        </w:rPr>
+        <w:t xml:space="preserve">Overlap/double-booking prevention</w:t>
+      </w:r>
+      <w:r>
+        <w:t xml:space="preserve"> and slot-locking under concurrency — call it out as an explicit requirement, not an assumption.</w:t>
+      </w:r>
+    </w:p>
+    <w:p>
+      <w:pPr>
+        <w:pStyle w:val="ListParagraph"/>
+        <w:numPr>
+          <w:ilvl w:val="0"/>
+          <w:numId w:val="1"/>
+        </w:numPr>
+        <w:spacing w:after="40"/>
+      </w:pPr>
+      <w:r>
+        <w:rPr>
+          <w:b/>
+          <w:bCs/>
+        </w:rPr>
+        <w:t xml:space="preserve">Time zones / clock source</w:t>
+      </w:r>
+      <w:r>
+        <w:t xml:space="preserve"> — trivial for Abuja-only, but define now to avoid reminder bugs.</w:t>
+      </w:r>
+    </w:p>
+    <w:p>
+      <w:pPr>
+        <w:pStyle w:val="ListParagraph"/>
+        <w:numPr>
+          <w:ilvl w:val="0"/>
+          <w:numId w:val="1"/>
+        </w:numPr>
+        <w:spacing w:after="40"/>
+      </w:pPr>
+      <w:r>
+        <w:rPr>
+          <w:b/>
+          <w:bCs/>
+        </w:rPr>
+        <w:t xml:space="preserve">No-show and cancellation policy</w:t>
+      </w:r>
+      <w:r>
+        <w:t xml:space="preserve"> — who bears the cost, and does it affect the patient's ability to rebook?</w:t>
+      </w:r>
+    </w:p>
+    <w:p>
+      <w:pPr>
+        <w:pStyle w:val="ListParagraph"/>
+        <w:numPr>
+          <w:ilvl w:val="0"/>
+          <w:numId w:val="1"/>
+        </w:numPr>
+        <w:spacing w:after="40"/>
+      </w:pPr>
+      <w:r>
+        <w:rPr>
+          <w:b/>
+          <w:bCs/>
+        </w:rPr>
+        <w:t xml:space="preserve">Notifications beyond SMS</w:t>
+      </w:r>
+      <w:r>
+        <w:t xml:space="preserve"> — email and in-app; SMS-only is fragile if delivery fails.</w:t>
+      </w:r>
+    </w:p>
+    <w:p>
+      <w:pPr>
+        <w:pStyle w:val="ListParagraph"/>
+        <w:numPr>
+          <w:ilvl w:val="0"/>
+          <w:numId w:val="1"/>
+        </w:numPr>
+        <w:spacing w:after="40"/>
+      </w:pPr>
+      <w:r>
+        <w:rPr>
+          <w:b/>
+          <w:bCs/>
+        </w:rPr>
+        <w:t xml:space="preserve">Search when nothing matches</w:t>
+      </w:r>
+      <w:r>
+        <w:t xml:space="preserve"> — empty-state and "notify me when available" behavior.</w:t>
+      </w:r>
+    </w:p>
+    <w:p>
+      <w:pPr>
+        <w:pStyle w:val="ListParagraph"/>
+        <w:numPr>
+          <w:ilvl w:val="0"/>
+          <w:numId w:val="1"/>
+        </w:numPr>
+        <w:spacing w:after="40"/>
+      </w:pPr>
+      <w:r>
+        <w:rPr>
+          <w:b/>
+          <w:bCs/>
+        </w:rPr>
+        <w:t xml:space="preserve">Patient identity uniqueness</w:t>
+      </w:r>
+      <w:r>
+        <w:t xml:space="preserve"> — one person, one medical record across institutions; how do you de-duplicate patients (phone number as key has edge cases — shared phones, changed numbers)?</w:t>
+      </w:r>
+    </w:p>
+    <w:p>
+      <w:pPr>
+        <w:spacing w:after="100"/>
+      </w:pPr>
+      <w:r>
+        <w:rPr>
+          <w:b/>
+          <w:bCs/>
+        </w:rPr>
+        <w:t xml:space="preserve">D. Operations &amp; trust</w:t>
+      </w:r>
+    </w:p>
+    <w:p>
+      <w:pPr>
+        <w:pStyle w:val="ListParagraph"/>
+        <w:numPr>
+          <w:ilvl w:val="0"/>
+          <w:numId w:val="1"/>
+        </w:numPr>
+        <w:spacing w:after="40"/>
+      </w:pPr>
+      <w:r>
+        <w:rPr>
+          <w:b/>
+          <w:bCs/>
+        </w:rPr>
+        <w:t xml:space="preserve">MDCN verification SOP</w:t>
+      </w:r>
+      <w:r>
+        <w:t xml:space="preserve"> — a documented manual process (who, SLA, evidence stored) so onboarding isn't a bottleneck and the "verified badge" is trustworthy.</w:t>
+      </w:r>
+    </w:p>
+    <w:p>
+      <w:pPr>
+        <w:pStyle w:val="ListParagraph"/>
+        <w:numPr>
+          <w:ilvl w:val="0"/>
+          <w:numId w:val="1"/>
+        </w:numPr>
+        <w:spacing w:after="40"/>
+      </w:pPr>
+      <w:r>
+        <w:rPr>
+          <w:b/>
+          <w:bCs/>
+        </w:rPr>
+        <w:t xml:space="preserve">Institution offboarding / subscription-expiry data handling</w:t>
+      </w:r>
+      <w:r>
+        <w:t xml:space="preserve"> — what happens to patient records when a clinic leaves? (Patients arguably own their history — clarify.)</w:t>
+      </w:r>
+    </w:p>
+    <w:p>
+      <w:pPr>
+        <w:pStyle w:val="ListParagraph"/>
+        <w:numPr>
+          <w:ilvl w:val="0"/>
+          <w:numId w:val="1"/>
+        </w:numPr>
+        <w:spacing w:after="40"/>
+      </w:pPr>
+      <w:r>
+        <w:rPr>
+          <w:b/>
+          <w:bCs/>
+        </w:rPr>
+        <w:t xml:space="preserve">Support &amp; feedback channel</w:t>
+      </w:r>
+      <w:r>
+        <w:t xml:space="preserve"> — how patients/clinics report problems during pilot.</w:t>
+      </w:r>
+    </w:p>
+    <w:p>
+      <w:pPr>
+        <w:pStyle w:val="ListParagraph"/>
+        <w:numPr>
+          <w:ilvl w:val="0"/>
+          <w:numId w:val="1"/>
+        </w:numPr>
+        <w:spacing w:after="40"/>
+      </w:pPr>
+      <w:r>
+        <w:rPr>
+          <w:b/>
+          <w:bCs/>
+        </w:rPr>
+        <w:t xml:space="preserve">Backups &amp; disaster recovery</w:t>
+      </w:r>
+      <w:r>
+        <w:t xml:space="preserve"> for medical data.</w:t>
+      </w:r>
+    </w:p>
+    <w:p>
+      <w:pPr>
+        <w:spacing w:after="100"/>
+      </w:pPr>
+      <w:r>
+        <w:rPr>
+          <w:b/>
+          <w:bCs/>
+        </w:rPr>
+        <w:t xml:space="preserve">E. Commercial</w:t>
+      </w:r>
+    </w:p>
+    <w:p>
+      <w:pPr>
+        <w:pStyle w:val="ListParagraph"/>
+        <w:numPr>
+          <w:ilvl w:val="0"/>
+          <w:numId w:val="1"/>
+        </w:numPr>
+        <w:spacing w:after="40"/>
+      </w:pPr>
+      <w:r>
+        <w:rPr>
+          <w:b/>
+          <w:bCs/>
+        </w:rPr>
+        <w:t xml:space="preserve">Pricing is undefined</w:t>
+      </w:r>
+      <w:r>
+        <w:t xml:space="preserve"> (₦___). Pilot needs at least a working number and a plan-by-size matrix to test willingness-to-pay.</w:t>
+      </w:r>
+    </w:p>
+    <w:p>
+      <w:pPr>
+        <w:pStyle w:val="ListParagraph"/>
+        <w:numPr>
+          <w:ilvl w:val="0"/>
+          <w:numId w:val="1"/>
+        </w:numPr>
+        <w:spacing w:after="40"/>
+      </w:pPr>
+      <w:r>
+        <w:rPr>
+          <w:b/>
+          <w:bCs/>
+        </w:rPr>
+        <w:t xml:space="preserve">Employer-sponsored plans</w:t>
+      </w:r>
+      <w:r>
+        <w:t xml:space="preserve"> (raised on the call) — decide in/out for pilot; likely Phase 2.</w:t>
+      </w:r>
+    </w:p>
+    <w:p>
+      <w:pPr>
+        <w:pStyle w:val="ListParagraph"/>
+        <w:numPr>
+          <w:ilvl w:val="0"/>
+          <w:numId w:val="1"/>
+        </w:numPr>
+        <w:spacing w:after="40"/>
+      </w:pPr>
+      <w:r>
+        <w:rPr>
+          <w:b/>
+          <w:bCs/>
+        </w:rPr>
+        <w:t xml:space="preserve">Virtual-consultation payment reconciliation</w:t>
+      </w:r>
+      <w:r>
+        <w:t xml:space="preserve"> — some clinics charge for online consults up front; that conflicts with "patients pay institutions directly" and may force an early payment touchpoint.</w:t>
+      </w:r>
+    </w:p>
+    <w:p>
+      <w:pPr>
+        <w:spacing w:after="100"/>
+      </w:pPr>
+      <w:r>
+        <w:rPr>
+          <w:b/>
+          <w:bCs/>
+        </w:rPr>
+        <w:t xml:space="preserve">F. Analytics &amp; measurement</w:t>
+      </w:r>
+    </w:p>
+    <w:p>
+      <w:pPr>
+        <w:pStyle w:val="ListParagraph"/>
+        <w:numPr>
+          <w:ilvl w:val="0"/>
+          <w:numId w:val="1"/>
+        </w:numPr>
+        <w:spacing w:after="40"/>
+      </w:pPr>
+      <w:r>
+        <w:t xml:space="preserve">Even if doctor-facing analytics are out, </w:t>
+      </w:r>
+      <w:r>
+        <w:rPr>
+          <w:b/>
+          <w:bCs/>
+        </w:rPr>
+        <w:t xml:space="preserve">instrument the product</w:t>
+      </w:r>
+      <w:r>
+        <w:t xml:space="preserve"> from day one (funnel events, no-show rates, activation) so you can prove the MVP thesis and price confidently. This is measurement infrastructure, not a user-facing feature.</w:t>
+      </w:r>
+    </w:p>
+    <w:p>
+      <w:pPr>
+        <w:spacing w:after="100"/>
+      </w:pPr>
+      <w:r>
+        <w:rPr>
+          <w:b/>
+          <w:bCs/>
+        </w:rPr>
+        <w:t xml:space="preserve">G. Design-system &amp; handoff</w:t>
+      </w:r>
+    </w:p>
+    <w:p>
+      <w:pPr>
+        <w:pStyle w:val="ListParagraph"/>
+        <w:numPr>
+          <w:ilvl w:val="0"/>
+          <w:numId w:val="1"/>
+        </w:numPr>
+        <w:spacing w:after="40"/>
+      </w:pPr>
+      <w:r>
+        <w:t xml:space="preserve">The stated goal that </w:t>
+      </w:r>
+      <w:r>
+        <w:rPr>
+          <w:b/>
+          <w:bCs/>
+        </w:rPr>
+        <w:t xml:space="preserve">"the UI communicates the data model to developers"</w:t>
+      </w:r>
+      <w:r>
+        <w:t xml:space="preserve"> should be an explicit handoff deliverable: annotated specs mapping each screen/field to a data entity, plus all screen </w:t>
+      </w:r>
+      <w:r>
+        <w:rPr>
+          <w:b/>
+          <w:bCs/>
+        </w:rPr>
+        <w:t xml:space="preserve">states</w:t>
+      </w:r>
+      <w:r>
+        <w:t xml:space="preserve"> (empty/loading/error/success). Make sure this is scoped and estimated.</w:t>
       </w:r>
     </w:p>
     <w:p>
@@ -10675,568 +10949,147 @@
         <w:spacing w:after="80" w:before="260"/>
       </w:pPr>
       <w:r>
-        <w:t xml:space="preserve">23. What You Might Be Missing — Gaps &amp; Recommendations</w:t>
-      </w:r>
-    </w:p>
-    <w:p>
-      <w:pPr>
-        <w:spacing w:after="100"/>
-      </w:pPr>
-      <w:r>
-        <w:t xml:space="preserve">A candid list of things not fully addressed in the brief/scope/MVP that typically bite medical platforms. Prioritised.</w:t>
-      </w:r>
-    </w:p>
-    <w:p>
-      <w:pPr>
-        <w:spacing w:after="100"/>
-      </w:pPr>
-      <w:r>
-        <w:rPr>
-          <w:b/>
-          <w:bCs/>
-        </w:rPr>
-        <w:t xml:space="preserve">A. Compliance &amp; legal (highest priority)</w:t>
-      </w:r>
-    </w:p>
-    <w:p>
-      <w:pPr>
-        <w:pStyle w:val="ListParagraph"/>
-        <w:numPr>
-          <w:ilvl w:val="0"/>
-          <w:numId w:val="1"/>
-        </w:numPr>
-        <w:spacing w:after="40"/>
-      </w:pPr>
-      <w:r>
-        <w:rPr>
-          <w:b/>
-          <w:bCs/>
-        </w:rPr>
-        <w:t xml:space="preserve">NDPA 2023 / NDPR compliance</w:t>
-      </w:r>
-      <w:r>
-        <w:t xml:space="preserve"> and a written data-protection/privacy policy, patient consent flows, and data-subject rights (access, deletion). Medical data is high-risk; build this into MVP, not later.</w:t>
-      </w:r>
-    </w:p>
-    <w:p>
-      <w:pPr>
-        <w:pStyle w:val="ListParagraph"/>
-        <w:numPr>
-          <w:ilvl w:val="0"/>
-          <w:numId w:val="1"/>
-        </w:numPr>
-        <w:spacing w:after="40"/>
-      </w:pPr>
-      <w:r>
-        <w:rPr>
-          <w:b/>
-          <w:bCs/>
-        </w:rPr>
-        <w:t xml:space="preserve">Terms of Service, provider agreements, and liability/disclaimer</w:t>
-      </w:r>
-      <w:r>
-        <w:t xml:space="preserve"> language — especially around telemedicine and clinical decisions made using Medra records. Consider professional-indemnity implications.</w:t>
-      </w:r>
-    </w:p>
-    <w:p>
-      <w:pPr>
-        <w:pStyle w:val="ListParagraph"/>
-        <w:numPr>
-          <w:ilvl w:val="0"/>
-          <w:numId w:val="1"/>
-        </w:numPr>
-        <w:spacing w:after="40"/>
-      </w:pPr>
-      <w:r>
-        <w:rPr>
-          <w:b/>
-          <w:bCs/>
-        </w:rPr>
-        <w:t xml:space="preserve">Data residency &amp; retention policy</w:t>
-      </w:r>
-      <w:r>
-        <w:t xml:space="preserve"> — where records are stored and for how long.</w:t>
-      </w:r>
-    </w:p>
-    <w:p>
-      <w:pPr>
-        <w:spacing w:after="100"/>
-      </w:pPr>
-      <w:r>
-        <w:rPr>
-          <w:b/>
-          <w:bCs/>
-        </w:rPr>
-        <w:t xml:space="preserve">B. Clinical safety</w:t>
-      </w:r>
-    </w:p>
-    <w:p>
-      <w:pPr>
-        <w:pStyle w:val="ListParagraph"/>
-        <w:numPr>
-          <w:ilvl w:val="0"/>
-          <w:numId w:val="1"/>
-        </w:numPr>
-        <w:spacing w:after="40"/>
-      </w:pPr>
-      <w:r>
-        <w:t xml:space="preserve">The </w:t>
-      </w:r>
-      <w:r>
-        <w:rPr>
-          <w:b/>
-          <w:bCs/>
-        </w:rPr>
-        <w:t xml:space="preserve">drug-interaction goal from the brief is currently manual</w:t>
-      </w:r>
-      <w:r>
-        <w:t xml:space="preserve"> (doctor reads history). Flag explicitly that automated interaction checking is a later phase, and ensure the record UI makes current medications prominent so a doctor </w:t>
-      </w:r>
-      <w:r>
-        <w:rPr>
-          <w:i/>
-          <w:iCs/>
-        </w:rPr>
-        <w:t xml:space="preserve">can</w:t>
-      </w:r>
-      <w:r>
-        <w:t xml:space="preserve"> catch clashes.</w:t>
-      </w:r>
-    </w:p>
-    <w:p>
-      <w:pPr>
-        <w:pStyle w:val="ListParagraph"/>
-        <w:numPr>
-          <w:ilvl w:val="0"/>
-          <w:numId w:val="1"/>
-        </w:numPr>
-        <w:spacing w:after="40"/>
-      </w:pPr>
-      <w:r>
-        <w:rPr>
-          <w:b/>
-          <w:bCs/>
-        </w:rPr>
-        <w:t xml:space="preserve">Allergies and chronic conditions</w:t>
-      </w:r>
-      <w:r>
-        <w:t xml:space="preserve"> aren't in the basic record fields — consider adding an "allergies / known conditions / current medications" summary block, as it's the highest-value safety data at a glance.</w:t>
-      </w:r>
-    </w:p>
-    <w:p>
-      <w:pPr>
-        <w:pStyle w:val="ListParagraph"/>
-        <w:numPr>
-          <w:ilvl w:val="0"/>
-          <w:numId w:val="1"/>
-        </w:numPr>
-        <w:spacing w:after="40"/>
-      </w:pPr>
-      <w:r>
-        <w:rPr>
-          <w:b/>
-          <w:bCs/>
-        </w:rPr>
-        <w:t xml:space="preserve">Emergency/critical info</w:t>
-      </w:r>
-      <w:r>
-        <w:t xml:space="preserve"> — blood group, emergency contact.</w:t>
-      </w:r>
-    </w:p>
-    <w:p>
-      <w:pPr>
-        <w:spacing w:after="100"/>
-      </w:pPr>
-      <w:r>
-        <w:rPr>
-          <w:b/>
-          <w:bCs/>
-        </w:rPr>
-        <w:t xml:space="preserve">C. Product/UX gaps</w:t>
-      </w:r>
-    </w:p>
-    <w:p>
-      <w:pPr>
-        <w:pStyle w:val="ListParagraph"/>
-        <w:numPr>
-          <w:ilvl w:val="0"/>
-          <w:numId w:val="1"/>
-        </w:numPr>
-        <w:spacing w:after="40"/>
-      </w:pPr>
-      <w:r>
-        <w:rPr>
-          <w:b/>
-          <w:bCs/>
-        </w:rPr>
-        <w:t xml:space="preserve">Rescheduling</w:t>
-      </w:r>
-      <w:r>
-        <w:t xml:space="preserve"> (not just cancel) — patients will want it; currently Phase 2. Confirm that's acceptable for pilot.</w:t>
-      </w:r>
-    </w:p>
-    <w:p>
-      <w:pPr>
-        <w:pStyle w:val="ListParagraph"/>
-        <w:numPr>
-          <w:ilvl w:val="0"/>
-          <w:numId w:val="1"/>
-        </w:numPr>
-        <w:spacing w:after="40"/>
-      </w:pPr>
-      <w:r>
-        <w:rPr>
-          <w:b/>
-          <w:bCs/>
-        </w:rPr>
-        <w:t xml:space="preserve">Overlap/double-booking prevention</w:t>
-      </w:r>
-      <w:r>
-        <w:t xml:space="preserve"> and slot-locking under concurrency — call it out as an explicit requirement, not an assumption.</w:t>
-      </w:r>
-    </w:p>
-    <w:p>
-      <w:pPr>
-        <w:pStyle w:val="ListParagraph"/>
-        <w:numPr>
-          <w:ilvl w:val="0"/>
-          <w:numId w:val="1"/>
-        </w:numPr>
-        <w:spacing w:after="40"/>
-      </w:pPr>
-      <w:r>
-        <w:rPr>
-          <w:b/>
-          <w:bCs/>
-        </w:rPr>
-        <w:t xml:space="preserve">Time zones / clock source</w:t>
-      </w:r>
-      <w:r>
-        <w:t xml:space="preserve"> — trivial for Abuja-only, but define now to avoid reminder bugs.</w:t>
-      </w:r>
-    </w:p>
-    <w:p>
-      <w:pPr>
-        <w:pStyle w:val="ListParagraph"/>
-        <w:numPr>
-          <w:ilvl w:val="0"/>
-          <w:numId w:val="1"/>
-        </w:numPr>
-        <w:spacing w:after="40"/>
-      </w:pPr>
-      <w:r>
-        <w:rPr>
-          <w:b/>
-          <w:bCs/>
-        </w:rPr>
-        <w:t xml:space="preserve">No-show and cancellation policy</w:t>
-      </w:r>
-      <w:r>
-        <w:t xml:space="preserve"> — who bears the cost, and does it affect the patient's ability to rebook?</w:t>
-      </w:r>
-    </w:p>
-    <w:p>
-      <w:pPr>
-        <w:pStyle w:val="ListParagraph"/>
-        <w:numPr>
-          <w:ilvl w:val="0"/>
-          <w:numId w:val="1"/>
-        </w:numPr>
-        <w:spacing w:after="40"/>
-      </w:pPr>
-      <w:r>
-        <w:rPr>
-          <w:b/>
-          <w:bCs/>
-        </w:rPr>
-        <w:t xml:space="preserve">Notifications beyond SMS</w:t>
-      </w:r>
-      <w:r>
-        <w:t xml:space="preserve"> — email and in-app; SMS-only is fragile if delivery fails.</w:t>
-      </w:r>
-    </w:p>
-    <w:p>
-      <w:pPr>
-        <w:pStyle w:val="ListParagraph"/>
-        <w:numPr>
-          <w:ilvl w:val="0"/>
-          <w:numId w:val="1"/>
-        </w:numPr>
-        <w:spacing w:after="40"/>
-      </w:pPr>
-      <w:r>
-        <w:rPr>
-          <w:b/>
-          <w:bCs/>
-        </w:rPr>
-        <w:t xml:space="preserve">Search when nothing matches</w:t>
-      </w:r>
-      <w:r>
-        <w:t xml:space="preserve"> — empty-state and "notify me when available" behavior.</w:t>
-      </w:r>
-    </w:p>
-    <w:p>
-      <w:pPr>
-        <w:pStyle w:val="ListParagraph"/>
-        <w:numPr>
-          <w:ilvl w:val="0"/>
-          <w:numId w:val="1"/>
-        </w:numPr>
-        <w:spacing w:after="40"/>
-      </w:pPr>
-      <w:r>
-        <w:rPr>
-          <w:b/>
-          <w:bCs/>
-        </w:rPr>
-        <w:t xml:space="preserve">Patient identity uniqueness</w:t>
-      </w:r>
-      <w:r>
-        <w:t xml:space="preserve"> — one person, one medical record across institutions; how do you de-duplicate patients (phone number as key has edge cases — shared phones, changed numbers)?</w:t>
-      </w:r>
-    </w:p>
-    <w:p>
-      <w:pPr>
-        <w:spacing w:after="100"/>
-      </w:pPr>
-      <w:r>
-        <w:rPr>
-          <w:b/>
-          <w:bCs/>
-        </w:rPr>
-        <w:t xml:space="preserve">D. Operations &amp; trust</w:t>
-      </w:r>
-    </w:p>
-    <w:p>
-      <w:pPr>
-        <w:pStyle w:val="ListParagraph"/>
-        <w:numPr>
-          <w:ilvl w:val="0"/>
-          <w:numId w:val="1"/>
-        </w:numPr>
-        <w:spacing w:after="40"/>
-      </w:pPr>
-      <w:r>
-        <w:rPr>
-          <w:b/>
-          <w:bCs/>
-        </w:rPr>
-        <w:t xml:space="preserve">MDCN verification SOP</w:t>
-      </w:r>
-      <w:r>
-        <w:t xml:space="preserve"> — a documented manual process (who, SLA, evidence stored) so onboarding isn't a bottleneck and the "verified badge" is trustworthy.</w:t>
-      </w:r>
-    </w:p>
-    <w:p>
-      <w:pPr>
-        <w:pStyle w:val="ListParagraph"/>
-        <w:numPr>
-          <w:ilvl w:val="0"/>
-          <w:numId w:val="1"/>
-        </w:numPr>
-        <w:spacing w:after="40"/>
-      </w:pPr>
-      <w:r>
-        <w:rPr>
-          <w:b/>
-          <w:bCs/>
-        </w:rPr>
-        <w:t xml:space="preserve">Institution offboarding / subscription-expiry data handling</w:t>
-      </w:r>
-      <w:r>
-        <w:t xml:space="preserve"> — what happens to patient records when a clinic leaves? (Patients arguably own their history — clarify.)</w:t>
-      </w:r>
-    </w:p>
-    <w:p>
-      <w:pPr>
-        <w:pStyle w:val="ListParagraph"/>
-        <w:numPr>
-          <w:ilvl w:val="0"/>
-          <w:numId w:val="1"/>
-        </w:numPr>
-        <w:spacing w:after="40"/>
-      </w:pPr>
-      <w:r>
-        <w:rPr>
-          <w:b/>
-          <w:bCs/>
-        </w:rPr>
-        <w:t xml:space="preserve">Support &amp; feedback channel</w:t>
-      </w:r>
-      <w:r>
-        <w:t xml:space="preserve"> — how patients/clinics report problems during pilot.</w:t>
-      </w:r>
-    </w:p>
-    <w:p>
-      <w:pPr>
-        <w:pStyle w:val="ListParagraph"/>
-        <w:numPr>
-          <w:ilvl w:val="0"/>
-          <w:numId w:val="1"/>
-        </w:numPr>
-        <w:spacing w:after="40"/>
-      </w:pPr>
-      <w:r>
-        <w:rPr>
-          <w:b/>
-          <w:bCs/>
-        </w:rPr>
-        <w:t xml:space="preserve">Backups &amp; disaster recovery</w:t>
-      </w:r>
-      <w:r>
-        <w:t xml:space="preserve"> for medical data.</w:t>
-      </w:r>
-    </w:p>
-    <w:p>
-      <w:pPr>
-        <w:spacing w:after="100"/>
-      </w:pPr>
-      <w:r>
-        <w:rPr>
-          <w:b/>
-          <w:bCs/>
-        </w:rPr>
-        <w:t xml:space="preserve">E. Commercial</w:t>
-      </w:r>
-    </w:p>
-    <w:p>
-      <w:pPr>
-        <w:pStyle w:val="ListParagraph"/>
-        <w:numPr>
-          <w:ilvl w:val="0"/>
-          <w:numId w:val="1"/>
-        </w:numPr>
-        <w:spacing w:after="40"/>
-      </w:pPr>
-      <w:r>
-        <w:rPr>
-          <w:b/>
-          <w:bCs/>
-        </w:rPr>
-        <w:t xml:space="preserve">Pricing is undefined</w:t>
-      </w:r>
-      <w:r>
-        <w:t xml:space="preserve"> (₦___). Pilot needs at least a working number and a plan-by-size matrix to test willingness-to-pay.</w:t>
-      </w:r>
-    </w:p>
-    <w:p>
-      <w:pPr>
-        <w:pStyle w:val="ListParagraph"/>
-        <w:numPr>
-          <w:ilvl w:val="0"/>
-          <w:numId w:val="1"/>
-        </w:numPr>
-        <w:spacing w:after="40"/>
-      </w:pPr>
-      <w:r>
-        <w:rPr>
-          <w:b/>
-          <w:bCs/>
-        </w:rPr>
-        <w:t xml:space="preserve">Employer-sponsored plans</w:t>
-      </w:r>
-      <w:r>
-        <w:t xml:space="preserve"> (raised on the call) — decide in/out for pilot; likely Phase 2.</w:t>
-      </w:r>
-    </w:p>
-    <w:p>
-      <w:pPr>
-        <w:pStyle w:val="ListParagraph"/>
-        <w:numPr>
-          <w:ilvl w:val="0"/>
-          <w:numId w:val="1"/>
-        </w:numPr>
-        <w:spacing w:after="40"/>
-      </w:pPr>
-      <w:r>
-        <w:rPr>
-          <w:b/>
-          <w:bCs/>
-        </w:rPr>
-        <w:t xml:space="preserve">Virtual-consultation payment reconciliation</w:t>
-      </w:r>
-      <w:r>
-        <w:t xml:space="preserve"> — some clinics charge for online consults up front; that conflicts with "patients pay institutions directly" and may force an early payment touchpoint.</w:t>
-      </w:r>
-    </w:p>
-    <w:p>
-      <w:pPr>
-        <w:spacing w:after="100"/>
-      </w:pPr>
-      <w:r>
-        <w:rPr>
-          <w:b/>
-          <w:bCs/>
-        </w:rPr>
-        <w:t xml:space="preserve">F. Analytics &amp; measurement</w:t>
-      </w:r>
-    </w:p>
-    <w:p>
-      <w:pPr>
-        <w:pStyle w:val="ListParagraph"/>
-        <w:numPr>
-          <w:ilvl w:val="0"/>
-          <w:numId w:val="1"/>
-        </w:numPr>
-        <w:spacing w:after="40"/>
-      </w:pPr>
-      <w:r>
-        <w:t xml:space="preserve">Even if doctor-facing analytics are out, </w:t>
-      </w:r>
-      <w:r>
-        <w:rPr>
-          <w:b/>
-          <w:bCs/>
-        </w:rPr>
-        <w:t xml:space="preserve">instrument the product</w:t>
-      </w:r>
-      <w:r>
-        <w:t xml:space="preserve"> from day one (funnel events, no-show rates, activation) so you can prove the MVP thesis and price confidently. This is measurement infrastructure, not a user-facing feature.</w:t>
-      </w:r>
-    </w:p>
-    <w:p>
-      <w:pPr>
-        <w:spacing w:after="100"/>
-      </w:pPr>
-      <w:r>
-        <w:rPr>
-          <w:b/>
-          <w:bCs/>
-        </w:rPr>
-        <w:t xml:space="preserve">G. Design-system &amp; handoff</w:t>
-      </w:r>
-    </w:p>
-    <w:p>
-      <w:pPr>
-        <w:pStyle w:val="ListParagraph"/>
-        <w:numPr>
-          <w:ilvl w:val="0"/>
-          <w:numId w:val="1"/>
-        </w:numPr>
-        <w:spacing w:after="40"/>
-      </w:pPr>
-      <w:r>
-        <w:t xml:space="preserve">The stated goal that </w:t>
-      </w:r>
-      <w:r>
-        <w:rPr>
-          <w:b/>
-          <w:bCs/>
-        </w:rPr>
-        <w:t xml:space="preserve">"the UI communicates the data model to developers"</w:t>
-      </w:r>
-      <w:r>
-        <w:t xml:space="preserve"> should be an explicit handoff deliverable: annotated specs mapping each screen/field to a data entity, plus all screen </w:t>
-      </w:r>
-      <w:r>
-        <w:rPr>
-          <w:b/>
-          <w:bCs/>
-        </w:rPr>
-        <w:t xml:space="preserve">states</w:t>
-      </w:r>
-      <w:r>
-        <w:t xml:space="preserve"> (empty/loading/error/success). Make sure this is scoped and estimated.</w:t>
+        <w:t xml:space="preserve">23. Glossary</w:t>
+      </w:r>
+    </w:p>
+    <w:p>
+      <w:pPr>
+        <w:pStyle w:val="ListParagraph"/>
+        <w:numPr>
+          <w:ilvl w:val="0"/>
+          <w:numId w:val="1"/>
+        </w:numPr>
+        <w:spacing w:after="40"/>
+      </w:pPr>
+      <w:r>
+        <w:rPr>
+          <w:b/>
+          <w:bCs/>
+        </w:rPr>
+        <w:t xml:space="preserve">MDCN</w:t>
+      </w:r>
+      <w:r>
+        <w:t xml:space="preserve"> — Medical and Dental Council of Nigeria (doctor licensing/identity).</w:t>
+      </w:r>
+    </w:p>
+    <w:p>
+      <w:pPr>
+        <w:pStyle w:val="ListParagraph"/>
+        <w:numPr>
+          <w:ilvl w:val="0"/>
+          <w:numId w:val="1"/>
+        </w:numPr>
+        <w:spacing w:after="40"/>
+      </w:pPr>
+      <w:r>
+        <w:rPr>
+          <w:b/>
+          <w:bCs/>
+        </w:rPr>
+        <w:t xml:space="preserve">NDPA / NDPR</w:t>
+      </w:r>
+      <w:r>
+        <w:t xml:space="preserve"> — Nigeria Data Protection Act 2023 / Regulation.</w:t>
+      </w:r>
+    </w:p>
+    <w:p>
+      <w:pPr>
+        <w:pStyle w:val="ListParagraph"/>
+        <w:numPr>
+          <w:ilvl w:val="0"/>
+          <w:numId w:val="1"/>
+        </w:numPr>
+        <w:spacing w:after="40"/>
+      </w:pPr>
+      <w:r>
+        <w:rPr>
+          <w:b/>
+          <w:bCs/>
+        </w:rPr>
+        <w:t xml:space="preserve">Paystack</w:t>
+      </w:r>
+      <w:r>
+        <w:t xml:space="preserve"> — payment processor for the clinic subscription.</w:t>
+      </w:r>
+    </w:p>
+    <w:p>
+      <w:pPr>
+        <w:pStyle w:val="ListParagraph"/>
+        <w:numPr>
+          <w:ilvl w:val="0"/>
+          <w:numId w:val="1"/>
+        </w:numPr>
+        <w:spacing w:after="40"/>
+      </w:pPr>
+      <w:r>
+        <w:rPr>
+          <w:b/>
+          <w:bCs/>
+        </w:rPr>
+        <w:t xml:space="preserve">Daily.co</w:t>
+      </w:r>
+      <w:r>
+        <w:t xml:space="preserve"> — video infrastructure (Phase 2 telemedicine automation).</w:t>
+      </w:r>
+    </w:p>
+    <w:p>
+      <w:pPr>
+        <w:pStyle w:val="ListParagraph"/>
+        <w:numPr>
+          <w:ilvl w:val="0"/>
+          <w:numId w:val="1"/>
+        </w:numPr>
+        <w:spacing w:after="40"/>
+      </w:pPr>
+      <w:r>
+        <w:rPr>
+          <w:b/>
+          <w:bCs/>
+        </w:rPr>
+        <w:t xml:space="preserve">RBAC</w:t>
+      </w:r>
+      <w:r>
+        <w:t xml:space="preserve"> — Role-Based Access Control.</w:t>
+      </w:r>
+    </w:p>
+    <w:p>
+      <w:pPr>
+        <w:pStyle w:val="ListParagraph"/>
+        <w:numPr>
+          <w:ilvl w:val="0"/>
+          <w:numId w:val="1"/>
+        </w:numPr>
+        <w:spacing w:after="40"/>
+      </w:pPr>
+      <w:r>
+        <w:rPr>
+          <w:b/>
+          <w:bCs/>
+        </w:rPr>
+        <w:t xml:space="preserve">Institution / Enterprise</w:t>
+      </w:r>
+      <w:r>
+        <w:t xml:space="preserve"> — a clinic/hospital; enterprise = multi-branch billed as one.</w:t>
+      </w:r>
+    </w:p>
+    <w:p>
+      <w:pPr>
+        <w:pStyle w:val="ListParagraph"/>
+        <w:numPr>
+          <w:ilvl w:val="0"/>
+          <w:numId w:val="1"/>
+        </w:numPr>
+        <w:spacing w:after="40"/>
+      </w:pPr>
+      <w:r>
+        <w:rPr>
+          <w:b/>
+          <w:bCs/>
+        </w:rPr>
+        <w:t xml:space="preserve">Verified badge</w:t>
+      </w:r>
+      <w:r>
+        <w:t xml:space="preserve"> — visible marker that Medra confirmed a provider's MDCN/licence.</w:t>
       </w:r>
     </w:p>
     <w:p>
@@ -11248,255 +11101,6 @@
       </w:pPr>
       <w:r>
         <w:t xml:space="preserve"/>
-      </w:r>
-    </w:p>
-    <w:p>
-      <w:pPr>
-        <w:pStyle w:val="Heading2"/>
-        <w:spacing w:after="80" w:before="260"/>
-      </w:pPr>
-      <w:r>
-        <w:t xml:space="preserve">24. Glossary</w:t>
-      </w:r>
-    </w:p>
-    <w:p>
-      <w:pPr>
-        <w:pStyle w:val="ListParagraph"/>
-        <w:numPr>
-          <w:ilvl w:val="0"/>
-          <w:numId w:val="1"/>
-        </w:numPr>
-        <w:spacing w:after="40"/>
-      </w:pPr>
-      <w:r>
-        <w:rPr>
-          <w:b/>
-          <w:bCs/>
-        </w:rPr>
-        <w:t xml:space="preserve">MDCN</w:t>
-      </w:r>
-      <w:r>
-        <w:t xml:space="preserve"> — Medical and Dental Council of Nigeria (doctor licensing/identity).</w:t>
-      </w:r>
-    </w:p>
-    <w:p>
-      <w:pPr>
-        <w:pStyle w:val="ListParagraph"/>
-        <w:numPr>
-          <w:ilvl w:val="0"/>
-          <w:numId w:val="1"/>
-        </w:numPr>
-        <w:spacing w:after="40"/>
-      </w:pPr>
-      <w:r>
-        <w:rPr>
-          <w:b/>
-          <w:bCs/>
-        </w:rPr>
-        <w:t xml:space="preserve">NDPA / NDPR</w:t>
-      </w:r>
-      <w:r>
-        <w:t xml:space="preserve"> — Nigeria Data Protection Act 2023 / Regulation.</w:t>
-      </w:r>
-    </w:p>
-    <w:p>
-      <w:pPr>
-        <w:pStyle w:val="ListParagraph"/>
-        <w:numPr>
-          <w:ilvl w:val="0"/>
-          <w:numId w:val="1"/>
-        </w:numPr>
-        <w:spacing w:after="40"/>
-      </w:pPr>
-      <w:r>
-        <w:rPr>
-          <w:b/>
-          <w:bCs/>
-        </w:rPr>
-        <w:t xml:space="preserve">Paystack</w:t>
-      </w:r>
-      <w:r>
-        <w:t xml:space="preserve"> — payment processor for the clinic subscription.</w:t>
-      </w:r>
-    </w:p>
-    <w:p>
-      <w:pPr>
-        <w:pStyle w:val="ListParagraph"/>
-        <w:numPr>
-          <w:ilvl w:val="0"/>
-          <w:numId w:val="1"/>
-        </w:numPr>
-        <w:spacing w:after="40"/>
-      </w:pPr>
-      <w:r>
-        <w:rPr>
-          <w:b/>
-          <w:bCs/>
-        </w:rPr>
-        <w:t xml:space="preserve">Daily.co</w:t>
-      </w:r>
-      <w:r>
-        <w:t xml:space="preserve"> — video infrastructure (Phase 2 telemedicine automation).</w:t>
-      </w:r>
-    </w:p>
-    <w:p>
-      <w:pPr>
-        <w:pStyle w:val="ListParagraph"/>
-        <w:numPr>
-          <w:ilvl w:val="0"/>
-          <w:numId w:val="1"/>
-        </w:numPr>
-        <w:spacing w:after="40"/>
-      </w:pPr>
-      <w:r>
-        <w:rPr>
-          <w:b/>
-          <w:bCs/>
-        </w:rPr>
-        <w:t xml:space="preserve">RBAC</w:t>
-      </w:r>
-      <w:r>
-        <w:t xml:space="preserve"> — Role-Based Access Control.</w:t>
-      </w:r>
-    </w:p>
-    <w:p>
-      <w:pPr>
-        <w:pStyle w:val="ListParagraph"/>
-        <w:numPr>
-          <w:ilvl w:val="0"/>
-          <w:numId w:val="1"/>
-        </w:numPr>
-        <w:spacing w:after="40"/>
-      </w:pPr>
-      <w:r>
-        <w:rPr>
-          <w:b/>
-          <w:bCs/>
-        </w:rPr>
-        <w:t xml:space="preserve">Institution / Enterprise</w:t>
-      </w:r>
-      <w:r>
-        <w:t xml:space="preserve"> — a clinic/hospital; enterprise = multi-branch billed as one.</w:t>
-      </w:r>
-    </w:p>
-    <w:p>
-      <w:pPr>
-        <w:pStyle w:val="ListParagraph"/>
-        <w:numPr>
-          <w:ilvl w:val="0"/>
-          <w:numId w:val="1"/>
-        </w:numPr>
-        <w:spacing w:after="40"/>
-      </w:pPr>
-      <w:r>
-        <w:rPr>
-          <w:b/>
-          <w:bCs/>
-        </w:rPr>
-        <w:t xml:space="preserve">Verified badge</w:t>
-      </w:r>
-      <w:r>
-        <w:t xml:space="preserve"> — visible marker that Medra confirmed a provider's MDCN/licence.</w:t>
-      </w:r>
-    </w:p>
-    <w:p>
-      <w:pPr>
-        <w:pBdr>
-          <w:bottom w:val="single" w:color="2E8B9E" w:sz="6" w:space="1"/>
-        </w:pBdr>
-        <w:spacing w:after="120" w:before="120"/>
-      </w:pPr>
-      <w:r>
-        <w:t xml:space="preserve"/>
-      </w:r>
-    </w:p>
-    <w:p>
-      <w:pPr>
-        <w:pStyle w:val="Heading2"/>
-        <w:spacing w:after="80" w:before="260"/>
-      </w:pPr>
-      <w:r>
-        <w:t xml:space="preserve">25. Appendix — Source Traceability</w:t>
-      </w:r>
-    </w:p>
-    <w:p>
-      <w:pPr>
-        <w:spacing w:after="100"/>
-      </w:pPr>
-      <w:r>
-        <w:t xml:space="preserve">This PRD synthesises three inputs:</w:t>
-      </w:r>
-    </w:p>
-    <w:p>
-      <w:pPr>
-        <w:pStyle w:val="ListParagraph"/>
-        <w:numPr>
-          <w:ilvl w:val="0"/>
-          <w:numId w:val="2"/>
-        </w:numPr>
-        <w:spacing w:after="40"/>
-      </w:pPr>
-      <w:r>
-        <w:rPr>
-          <w:b/>
-          <w:bCs/>
-        </w:rPr>
-        <w:t xml:space="preserve">UI/UX Design Brief</w:t>
-      </w:r>
-      <w:r>
-        <w:t xml:space="preserve"> — discovery call transcript (Godwin Okwor × Israel Oni, 10 Jul 2026): three-tier vision, institution-pays model, portable history, drug-clash motivation, Abuja pilot, enterprise/multi-branch, private practitioners.</w:t>
-      </w:r>
-    </w:p>
-    <w:p>
-      <w:pPr>
-        <w:pStyle w:val="ListParagraph"/>
-        <w:numPr>
-          <w:ilvl w:val="0"/>
-          <w:numId w:val="2"/>
-        </w:numPr>
-        <w:spacing w:after="40"/>
-      </w:pPr>
-      <w:r>
-        <w:rPr>
-          <w:b/>
-          <w:bCs/>
-        </w:rPr>
-        <w:t xml:space="preserve">UI/UX Design Scope</w:t>
-      </w:r>
-      <w:r>
-        <w:t xml:space="preserve"> — roles, per-role design scope, deliverables, 5–7 week process, and 10 pre-kickoff questions.</w:t>
-      </w:r>
-    </w:p>
-    <w:p>
-      <w:pPr>
-        <w:pStyle w:val="ListParagraph"/>
-        <w:numPr>
-          <w:ilvl w:val="0"/>
-          <w:numId w:val="2"/>
-        </w:numPr>
-        <w:spacing w:after="40"/>
-      </w:pPr>
-      <w:r>
-        <w:rPr>
-          <w:b/>
-          <w:bCs/>
-        </w:rPr>
-        <w:t xml:space="preserve">Medra MVP Feature Set</w:t>
-      </w:r>
-      <w:r>
-        <w:t xml:space="preserve"> — the nine modules, the "one question" MVP thesis, explicit out-of-scope list, and the one-paragraph MVP definition.</w:t>
-      </w:r>
-    </w:p>
-    <w:p>
-      <w:pPr>
-        <w:spacing w:after="100"/>
-      </w:pPr>
-      <w:r>
-        <w:rPr>
-          <w:i/>
-          <w:iCs/>
-        </w:rPr>
-        <w:t xml:space="preserve">End of document.</w:t>
       </w:r>
     </w:p>
     <w:sectPr>

</xml_diff>